<commit_message>
fix: _parse_date 연도 범위(2000-2099) 검증 추가 + 보고서 DOCX 이미지ID 중복 수정
- _parse_date: 2100+ 날짜 입력 시 형식 오류 처리
- B04_보고서_최종.docx: wp:docPr id 중복(18개) → 고유값으로 수정 (Word 열기 오류 해결)

Co-Authored-By: Claude Sonnet 4.6 <noreply@anthropic.com>
</commit_message>
<xml_diff>
--- a/발표준비/B04_보고서_최종.docx
+++ b/발표준비/B04_보고서_최종.docx
@@ -929,7 +929,7 @@
                 <wp:inline distT="0" distB="0" distL="0" distR="0">
                   <wp:extent cx="3657600" cy="1280160"/>
                   <wp:effectExtent l="0" t="0" r="0" b="0"/>
-                  <wp:docPr id="1" name="tc_6.1-2.png"/>
+                  <wp:docPr id="170" name="tc_6.1-2.png"/>
                   <ns2:graphic xmlns:ns2="http://schemas.openxmlformats.org/drawingml/2006/main">
                     <ns2:graphicData uri="http://schemas.openxmlformats.org/drawingml/2006/picture">
                       <ns3:pic xmlns:ns3="http://schemas.openxmlformats.org/drawingml/2006/picture">
@@ -2760,7 +2760,7 @@
                 <wp:inline distT="0" distB="0" distL="0" distR="0">
                   <wp:extent cx="3657600" cy="1115568"/>
                   <wp:effectExtent l="0" t="0" r="0" b="0"/>
-                  <wp:docPr id="1" name="tc_5.5-6.png"/>
+                  <wp:docPr id="171" name="tc_5.5-6.png"/>
                   <ns2:graphic xmlns:ns2="http://schemas.openxmlformats.org/drawingml/2006/main">
                     <ns2:graphicData uri="http://schemas.openxmlformats.org/drawingml/2006/picture">
                       <ns3:pic xmlns:ns3="http://schemas.openxmlformats.org/drawingml/2006/picture">
@@ -4106,7 +4106,7 @@
                 <wp:inline distT="0" distB="0" distL="0" distR="0">
                   <wp:extent cx="3657600" cy="1115568"/>
                   <wp:effectExtent l="0" t="0" r="0" b="0"/>
-                  <wp:docPr id="1" name="tc_batch_201.png"/>
+                  <wp:docPr id="172" name="tc_batch_201.png"/>
                   <ns2:graphic xmlns:ns2="http://schemas.openxmlformats.org/drawingml/2006/main">
                     <ns2:graphicData uri="http://schemas.openxmlformats.org/drawingml/2006/picture">
                       <ns3:pic xmlns:ns3="http://schemas.openxmlformats.org/drawingml/2006/picture">
@@ -4791,7 +4791,7 @@
                 <wp:inline distT="0" distB="0" distL="0" distR="0">
                   <wp:extent cx="3657600" cy="2596896"/>
                   <wp:effectExtent l="0" t="0" r="0" b="0"/>
-                  <wp:docPr id="1" name="tc_batch_202.png"/>
+                  <wp:docPr id="173" name="tc_batch_202.png"/>
                   <ns2:graphic xmlns:ns2="http://schemas.openxmlformats.org/drawingml/2006/main">
                     <ns2:graphicData uri="http://schemas.openxmlformats.org/drawingml/2006/picture">
                       <ns3:pic xmlns:ns3="http://schemas.openxmlformats.org/drawingml/2006/picture">
@@ -5041,7 +5041,7 @@
                 <wp:inline distT="0" distB="0" distL="0" distR="0">
                   <wp:extent cx="3657600" cy="2596896"/>
                   <wp:effectExtent l="0" t="0" r="0" b="0"/>
-                  <wp:docPr id="1" name="tc_batch_203.png"/>
+                  <wp:docPr id="174" name="tc_batch_203.png"/>
                   <ns2:graphic xmlns:ns2="http://schemas.openxmlformats.org/drawingml/2006/main">
                     <ns2:graphicData uri="http://schemas.openxmlformats.org/drawingml/2006/picture">
                       <ns3:pic xmlns:ns3="http://schemas.openxmlformats.org/drawingml/2006/picture">
@@ -5183,7 +5183,7 @@
                 <wp:inline distT="0" distB="0" distL="0" distR="0">
                   <wp:extent cx="3657600" cy="2596896"/>
                   <wp:effectExtent l="0" t="0" r="0" b="0"/>
-                  <wp:docPr id="1" name="tc_batch_204.png"/>
+                  <wp:docPr id="175" name="tc_batch_204.png"/>
                   <ns2:graphic xmlns:ns2="http://schemas.openxmlformats.org/drawingml/2006/main">
                     <ns2:graphicData uri="http://schemas.openxmlformats.org/drawingml/2006/picture">
                       <ns3:pic xmlns:ns3="http://schemas.openxmlformats.org/drawingml/2006/picture">
@@ -5556,7 +5556,7 @@
                 <wp:inline distT="0" distB="0" distL="0" distR="0">
                   <wp:extent cx="3657600" cy="2432304"/>
                   <wp:effectExtent l="0" t="0" r="0" b="0"/>
-                  <wp:docPr id="1" name="tc_batch_206.png"/>
+                  <wp:docPr id="176" name="tc_batch_206.png"/>
                   <ns2:graphic xmlns:ns2="http://schemas.openxmlformats.org/drawingml/2006/main">
                     <ns2:graphicData uri="http://schemas.openxmlformats.org/drawingml/2006/picture">
                       <ns3:pic xmlns:ns3="http://schemas.openxmlformats.org/drawingml/2006/picture">
@@ -5702,7 +5702,7 @@
                 <wp:inline distT="0" distB="0" distL="0" distR="0">
                   <wp:extent cx="3657600" cy="2432304"/>
                   <wp:effectExtent l="0" t="0" r="0" b="0"/>
-                  <wp:docPr id="1" name="tc_batch_207.png"/>
+                  <wp:docPr id="177" name="tc_batch_207.png"/>
                   <ns2:graphic xmlns:ns2="http://schemas.openxmlformats.org/drawingml/2006/main">
                     <ns2:graphicData uri="http://schemas.openxmlformats.org/drawingml/2006/picture">
                       <ns3:pic xmlns:ns3="http://schemas.openxmlformats.org/drawingml/2006/picture">
@@ -5847,7 +5847,7 @@
                 <wp:inline distT="0" distB="0" distL="0" distR="0">
                   <wp:extent cx="3657600" cy="2596896"/>
                   <wp:effectExtent l="0" t="0" r="0" b="0"/>
-                  <wp:docPr id="1" name="tc_batch_205.png"/>
+                  <wp:docPr id="178" name="tc_batch_205.png"/>
                   <ns2:graphic xmlns:ns2="http://schemas.openxmlformats.org/drawingml/2006/main">
                     <ns2:graphicData uri="http://schemas.openxmlformats.org/drawingml/2006/picture">
                       <ns3:pic xmlns:ns3="http://schemas.openxmlformats.org/drawingml/2006/picture">
@@ -5983,7 +5983,7 @@
                 <wp:inline distT="0" distB="0" distL="0" distR="0">
                   <wp:extent cx="3657600" cy="2596896"/>
                   <wp:effectExtent l="0" t="0" r="0" b="0"/>
-                  <wp:docPr id="1" name="tc_batch_214.png"/>
+                  <wp:docPr id="179" name="tc_batch_214.png"/>
                   <ns2:graphic xmlns:ns2="http://schemas.openxmlformats.org/drawingml/2006/main">
                     <ns2:graphicData uri="http://schemas.openxmlformats.org/drawingml/2006/picture">
                       <ns3:pic xmlns:ns3="http://schemas.openxmlformats.org/drawingml/2006/picture">
@@ -6109,7 +6109,7 @@
                 <wp:inline distT="0" distB="0" distL="0" distR="0">
                   <wp:extent cx="3657600" cy="2596896"/>
                   <wp:effectExtent l="0" t="0" r="0" b="0"/>
-                  <wp:docPr id="1" name="tc_batch_215.png"/>
+                  <wp:docPr id="180" name="tc_batch_215.png"/>
                   <ns2:graphic xmlns:ns2="http://schemas.openxmlformats.org/drawingml/2006/main">
                     <ns2:graphicData uri="http://schemas.openxmlformats.org/drawingml/2006/picture">
                       <ns3:pic xmlns:ns3="http://schemas.openxmlformats.org/drawingml/2006/picture">
@@ -6249,7 +6249,7 @@
                 <wp:inline distT="0" distB="0" distL="0" distR="0">
                   <wp:extent cx="3657600" cy="2596896"/>
                   <wp:effectExtent l="0" t="0" r="0" b="0"/>
-                  <wp:docPr id="1" name="tc_batch_216.png"/>
+                  <wp:docPr id="181" name="tc_batch_216.png"/>
                   <ns2:graphic xmlns:ns2="http://schemas.openxmlformats.org/drawingml/2006/main">
                     <ns2:graphicData uri="http://schemas.openxmlformats.org/drawingml/2006/picture">
                       <ns3:pic xmlns:ns3="http://schemas.openxmlformats.org/drawingml/2006/picture">
@@ -11354,7 +11354,7 @@
                 <wp:inline distT="0" distB="0" distL="0" distR="0">
                   <wp:extent cx="3657600" cy="3090672"/>
                   <wp:effectExtent l="0" t="0" r="0" b="0"/>
-                  <wp:docPr id="1" name="tc_batch_208.png"/>
+                  <wp:docPr id="182" name="tc_batch_208.png"/>
                   <ns2:graphic xmlns:ns2="http://schemas.openxmlformats.org/drawingml/2006/main">
                     <ns2:graphicData uri="http://schemas.openxmlformats.org/drawingml/2006/picture">
                       <ns3:pic xmlns:ns3="http://schemas.openxmlformats.org/drawingml/2006/picture">
@@ -11616,7 +11616,7 @@
                 <wp:inline distT="0" distB="0" distL="0" distR="0">
                   <wp:extent cx="3657600" cy="3255264"/>
                   <wp:effectExtent l="0" t="0" r="0" b="0"/>
-                  <wp:docPr id="1" name="tc_batch_209.png"/>
+                  <wp:docPr id="183" name="tc_batch_209.png"/>
                   <ns2:graphic xmlns:ns2="http://schemas.openxmlformats.org/drawingml/2006/main">
                     <ns2:graphicData uri="http://schemas.openxmlformats.org/drawingml/2006/picture">
                       <ns3:pic xmlns:ns3="http://schemas.openxmlformats.org/drawingml/2006/picture">
@@ -11753,7 +11753,7 @@
                 <wp:inline distT="0" distB="0" distL="0" distR="0">
                   <wp:extent cx="3657600" cy="3337560"/>
                   <wp:effectExtent l="0" t="0" r="0" b="0"/>
-                  <wp:docPr id="1" name="tc_batch_210.png"/>
+                  <wp:docPr id="184" name="tc_batch_210.png"/>
                   <ns2:graphic xmlns:ns2="http://schemas.openxmlformats.org/drawingml/2006/main">
                     <ns2:graphicData uri="http://schemas.openxmlformats.org/drawingml/2006/picture">
                       <ns3:pic xmlns:ns3="http://schemas.openxmlformats.org/drawingml/2006/picture">
@@ -11894,7 +11894,7 @@
                 <wp:inline distT="0" distB="0" distL="0" distR="0">
                   <wp:extent cx="3657600" cy="3255264"/>
                   <wp:effectExtent l="0" t="0" r="0" b="0"/>
-                  <wp:docPr id="1" name="tc_batch_211.png"/>
+                  <wp:docPr id="185" name="tc_batch_211.png"/>
                   <ns2:graphic xmlns:ns2="http://schemas.openxmlformats.org/drawingml/2006/main">
                     <ns2:graphicData uri="http://schemas.openxmlformats.org/drawingml/2006/picture">
                       <ns3:pic xmlns:ns3="http://schemas.openxmlformats.org/drawingml/2006/picture">
@@ -13531,7 +13531,7 @@
                 <wp:inline distT="0" distB="0" distL="0" distR="0">
                   <wp:extent cx="3657600" cy="2926080"/>
                   <wp:effectExtent l="0" t="0" r="0" b="0"/>
-                  <wp:docPr id="1" name="tc_batch_212.png"/>
+                  <wp:docPr id="186" name="tc_batch_212.png"/>
                   <ns2:graphic xmlns:ns2="http://schemas.openxmlformats.org/drawingml/2006/main">
                     <ns2:graphicData uri="http://schemas.openxmlformats.org/drawingml/2006/picture">
                       <ns3:pic xmlns:ns3="http://schemas.openxmlformats.org/drawingml/2006/picture">
@@ -13672,7 +13672,7 @@
                 <wp:inline distT="0" distB="0" distL="0" distR="0">
                   <wp:extent cx="3657600" cy="2926080"/>
                   <wp:effectExtent l="0" t="0" r="0" b="0"/>
-                  <wp:docPr id="1" name="tc_batch_213.png"/>
+                  <wp:docPr id="187" name="tc_batch_213.png"/>
                   <ns2:graphic xmlns:ns2="http://schemas.openxmlformats.org/drawingml/2006/main">
                     <ns2:graphicData uri="http://schemas.openxmlformats.org/drawingml/2006/picture">
                       <ns3:pic xmlns:ns3="http://schemas.openxmlformats.org/drawingml/2006/picture">

</xml_diff>

<commit_message>
fix: 로그인 재입력 루프(6.4-3/6.4-4) + DOCX DrawingML 구조 수정
- auth.py: check_user_id() 추가 — ID 존재·활성 여부 선행 확인
- main.py: 로그인 2단계 루프 구현
  - 존재하지 않는 ID / 비활성 계정 → ID 재입력
  - 비밀번호 불일치 → 비밀번호만 재입력
- B04_보고서_최종.docx: make_inline_xml 생성 이미지 DrawingML 수정
  (nvPicPr, a:xfrm, a:prstGeom, wp:cNvGraphicFramePr 누락 요소 보완)

Co-Authored-By: Claude Sonnet 4.6 <noreply@anthropic.com>
</commit_message>
<xml_diff>
--- a/발표준비/B04_보고서_최종.docx
+++ b/발표준비/B04_보고서_최종.docx
@@ -925,24 +925,39 @@
           </w:tcPr>
           <w:p>
             <w:r>
-              <w:drawing>
-                <wp:inline distT="0" distB="0" distL="0" distR="0">
+              <w:drawing xmlns:w="http://schemas.openxmlformats.org/wordprocessingml/2006/main" xmlns:wp="http://schemas.openxmlformats.org/drawingml/2006/wordprocessingDrawing" xmlns:a="http://schemas.openxmlformats.org/drawingml/2006/main" xmlns:pic="http://schemas.openxmlformats.org/drawingml/2006/picture" xmlns:r="http://schemas.openxmlformats.org/officeDocument/2006/relationships">
+                <wp:inline distT="0" distB="0" distL="114300" distR="114300">
                   <wp:extent cx="3657600" cy="1280160"/>
                   <wp:effectExtent l="0" t="0" r="0" b="0"/>
                   <wp:docPr id="170" name="tc_6.1-2.png"/>
-                  <ns2:graphic xmlns:ns2="http://schemas.openxmlformats.org/drawingml/2006/main">
-                    <ns2:graphicData uri="http://schemas.openxmlformats.org/drawingml/2006/picture">
-                      <ns3:pic xmlns:ns3="http://schemas.openxmlformats.org/drawingml/2006/picture">
-                        <ns3:nvPicPr/>
-                        <ns3:blipFill>
-                          <ns2:blip r:embed="rId65"/>
-                        </ns3:blipFill>
-                        <ns3:spPr>
-                          <ns2:xfrm/>
-                        </ns3:spPr>
-                      </ns3:pic>
-                    </ns2:graphicData>
-                  </ns2:graphic>
+                  <wp:cNvGraphicFramePr>
+                    <a:graphicFrameLocks xmlns:a="http://schemas.openxmlformats.org/drawingml/2006/main" noChangeAspect="1"/>
+                  </wp:cNvGraphicFramePr>
+                  <a:graphic xmlns:a="http://schemas.openxmlformats.org/drawingml/2006/main">
+                    <a:graphicData uri="http://schemas.openxmlformats.org/drawingml/2006/picture">
+                      <pic:pic xmlns:pic="http://schemas.openxmlformats.org/drawingml/2006/picture">
+                        <pic:nvPicPr>
+                          <pic:cNvPr id="170" name="tc_6.1-2.png"/>
+                          <pic:cNvPicPr/>
+                        </pic:nvPicPr>
+                        <pic:blipFill>
+                          <a:blip xmlns:a="http://schemas.openxmlformats.org/drawingml/2006/main" r:embed="rId65"/>
+                          <a:stretch xmlns:a="http://schemas.openxmlformats.org/drawingml/2006/main">
+                            <a:fillRect/>
+                          </a:stretch>
+                        </pic:blipFill>
+                        <pic:spPr>
+                          <a:xfrm xmlns:a="http://schemas.openxmlformats.org/drawingml/2006/main">
+                            <a:off x="0" y="0"/>
+                            <a:ext cx="3657600" cy="1280160"/>
+                          </a:xfrm>
+                          <a:prstGeom xmlns:a="http://schemas.openxmlformats.org/drawingml/2006/main" prst="rect">
+                            <a:avLst/>
+                          </a:prstGeom>
+                        </pic:spPr>
+                      </pic:pic>
+                    </a:graphicData>
+                  </a:graphic>
                 </wp:inline>
               </w:drawing>
             </w:r>
@@ -2756,24 +2771,39 @@
           </w:tcPr>
           <w:p>
             <w:r>
-              <w:drawing>
-                <wp:inline distT="0" distB="0" distL="0" distR="0">
+              <w:drawing xmlns:w="http://schemas.openxmlformats.org/wordprocessingml/2006/main" xmlns:wp="http://schemas.openxmlformats.org/drawingml/2006/wordprocessingDrawing" xmlns:a="http://schemas.openxmlformats.org/drawingml/2006/main" xmlns:pic="http://schemas.openxmlformats.org/drawingml/2006/picture" xmlns:r="http://schemas.openxmlformats.org/officeDocument/2006/relationships">
+                <wp:inline distT="0" distB="0" distL="114300" distR="114300">
                   <wp:extent cx="3657600" cy="1115568"/>
                   <wp:effectExtent l="0" t="0" r="0" b="0"/>
                   <wp:docPr id="171" name="tc_5.5-6.png"/>
-                  <ns2:graphic xmlns:ns2="http://schemas.openxmlformats.org/drawingml/2006/main">
-                    <ns2:graphicData uri="http://schemas.openxmlformats.org/drawingml/2006/picture">
-                      <ns3:pic xmlns:ns3="http://schemas.openxmlformats.org/drawingml/2006/picture">
-                        <ns3:nvPicPr/>
-                        <ns3:blipFill>
-                          <ns2:blip r:embed="rId66"/>
-                        </ns3:blipFill>
-                        <ns3:spPr>
-                          <ns2:xfrm/>
-                        </ns3:spPr>
-                      </ns3:pic>
-                    </ns2:graphicData>
-                  </ns2:graphic>
+                  <wp:cNvGraphicFramePr>
+                    <a:graphicFrameLocks xmlns:a="http://schemas.openxmlformats.org/drawingml/2006/main" noChangeAspect="1"/>
+                  </wp:cNvGraphicFramePr>
+                  <a:graphic xmlns:a="http://schemas.openxmlformats.org/drawingml/2006/main">
+                    <a:graphicData uri="http://schemas.openxmlformats.org/drawingml/2006/picture">
+                      <pic:pic xmlns:pic="http://schemas.openxmlformats.org/drawingml/2006/picture">
+                        <pic:nvPicPr>
+                          <pic:cNvPr id="171" name="tc_5.5-6.png"/>
+                          <pic:cNvPicPr/>
+                        </pic:nvPicPr>
+                        <pic:blipFill>
+                          <a:blip xmlns:a="http://schemas.openxmlformats.org/drawingml/2006/main" r:embed="rId66"/>
+                          <a:stretch xmlns:a="http://schemas.openxmlformats.org/drawingml/2006/main">
+                            <a:fillRect/>
+                          </a:stretch>
+                        </pic:blipFill>
+                        <pic:spPr>
+                          <a:xfrm xmlns:a="http://schemas.openxmlformats.org/drawingml/2006/main">
+                            <a:off x="0" y="0"/>
+                            <a:ext cx="3657600" cy="1115568"/>
+                          </a:xfrm>
+                          <a:prstGeom xmlns:a="http://schemas.openxmlformats.org/drawingml/2006/main" prst="rect">
+                            <a:avLst/>
+                          </a:prstGeom>
+                        </pic:spPr>
+                      </pic:pic>
+                    </a:graphicData>
+                  </a:graphic>
                 </wp:inline>
               </w:drawing>
             </w:r>
@@ -4102,24 +4132,39 @@
           </w:tcPr>
           <w:p>
             <w:r>
-              <w:drawing>
-                <wp:inline distT="0" distB="0" distL="0" distR="0">
+              <w:drawing xmlns:w="http://schemas.openxmlformats.org/wordprocessingml/2006/main" xmlns:wp="http://schemas.openxmlformats.org/drawingml/2006/wordprocessingDrawing" xmlns:a="http://schemas.openxmlformats.org/drawingml/2006/main" xmlns:pic="http://schemas.openxmlformats.org/drawingml/2006/picture" xmlns:r="http://schemas.openxmlformats.org/officeDocument/2006/relationships">
+                <wp:inline distT="0" distB="0" distL="114300" distR="114300">
                   <wp:extent cx="3657600" cy="1115568"/>
                   <wp:effectExtent l="0" t="0" r="0" b="0"/>
                   <wp:docPr id="172" name="tc_batch_201.png"/>
-                  <ns2:graphic xmlns:ns2="http://schemas.openxmlformats.org/drawingml/2006/main">
-                    <ns2:graphicData uri="http://schemas.openxmlformats.org/drawingml/2006/picture">
-                      <ns3:pic xmlns:ns3="http://schemas.openxmlformats.org/drawingml/2006/picture">
-                        <ns3:nvPicPr/>
-                        <ns3:blipFill>
-                          <ns2:blip r:embed="rId67"/>
-                        </ns3:blipFill>
-                        <ns3:spPr>
-                          <ns2:xfrm/>
-                        </ns3:spPr>
-                      </ns3:pic>
-                    </ns2:graphicData>
-                  </ns2:graphic>
+                  <wp:cNvGraphicFramePr>
+                    <a:graphicFrameLocks xmlns:a="http://schemas.openxmlformats.org/drawingml/2006/main" noChangeAspect="1"/>
+                  </wp:cNvGraphicFramePr>
+                  <a:graphic xmlns:a="http://schemas.openxmlformats.org/drawingml/2006/main">
+                    <a:graphicData uri="http://schemas.openxmlformats.org/drawingml/2006/picture">
+                      <pic:pic xmlns:pic="http://schemas.openxmlformats.org/drawingml/2006/picture">
+                        <pic:nvPicPr>
+                          <pic:cNvPr id="172" name="tc_batch_201.png"/>
+                          <pic:cNvPicPr/>
+                        </pic:nvPicPr>
+                        <pic:blipFill>
+                          <a:blip xmlns:a="http://schemas.openxmlformats.org/drawingml/2006/main" r:embed="rId67"/>
+                          <a:stretch xmlns:a="http://schemas.openxmlformats.org/drawingml/2006/main">
+                            <a:fillRect/>
+                          </a:stretch>
+                        </pic:blipFill>
+                        <pic:spPr>
+                          <a:xfrm xmlns:a="http://schemas.openxmlformats.org/drawingml/2006/main">
+                            <a:off x="0" y="0"/>
+                            <a:ext cx="3657600" cy="1115568"/>
+                          </a:xfrm>
+                          <a:prstGeom xmlns:a="http://schemas.openxmlformats.org/drawingml/2006/main" prst="rect">
+                            <a:avLst/>
+                          </a:prstGeom>
+                        </pic:spPr>
+                      </pic:pic>
+                    </a:graphicData>
+                  </a:graphic>
                 </wp:inline>
               </w:drawing>
             </w:r>
@@ -4787,24 +4832,39 @@
           </w:tcPr>
           <w:p>
             <w:r>
-              <w:drawing>
-                <wp:inline distT="0" distB="0" distL="0" distR="0">
+              <w:drawing xmlns:w="http://schemas.openxmlformats.org/wordprocessingml/2006/main" xmlns:wp="http://schemas.openxmlformats.org/drawingml/2006/wordprocessingDrawing" xmlns:a="http://schemas.openxmlformats.org/drawingml/2006/main" xmlns:pic="http://schemas.openxmlformats.org/drawingml/2006/picture" xmlns:r="http://schemas.openxmlformats.org/officeDocument/2006/relationships">
+                <wp:inline distT="0" distB="0" distL="114300" distR="114300">
                   <wp:extent cx="3657600" cy="2596896"/>
                   <wp:effectExtent l="0" t="0" r="0" b="0"/>
                   <wp:docPr id="173" name="tc_batch_202.png"/>
-                  <ns2:graphic xmlns:ns2="http://schemas.openxmlformats.org/drawingml/2006/main">
-                    <ns2:graphicData uri="http://schemas.openxmlformats.org/drawingml/2006/picture">
-                      <ns3:pic xmlns:ns3="http://schemas.openxmlformats.org/drawingml/2006/picture">
-                        <ns3:nvPicPr/>
-                        <ns3:blipFill>
-                          <ns2:blip r:embed="rId68"/>
-                        </ns3:blipFill>
-                        <ns3:spPr>
-                          <ns2:xfrm/>
-                        </ns3:spPr>
-                      </ns3:pic>
-                    </ns2:graphicData>
-                  </ns2:graphic>
+                  <wp:cNvGraphicFramePr>
+                    <a:graphicFrameLocks xmlns:a="http://schemas.openxmlformats.org/drawingml/2006/main" noChangeAspect="1"/>
+                  </wp:cNvGraphicFramePr>
+                  <a:graphic xmlns:a="http://schemas.openxmlformats.org/drawingml/2006/main">
+                    <a:graphicData uri="http://schemas.openxmlformats.org/drawingml/2006/picture">
+                      <pic:pic xmlns:pic="http://schemas.openxmlformats.org/drawingml/2006/picture">
+                        <pic:nvPicPr>
+                          <pic:cNvPr id="173" name="tc_batch_202.png"/>
+                          <pic:cNvPicPr/>
+                        </pic:nvPicPr>
+                        <pic:blipFill>
+                          <a:blip xmlns:a="http://schemas.openxmlformats.org/drawingml/2006/main" r:embed="rId68"/>
+                          <a:stretch xmlns:a="http://schemas.openxmlformats.org/drawingml/2006/main">
+                            <a:fillRect/>
+                          </a:stretch>
+                        </pic:blipFill>
+                        <pic:spPr>
+                          <a:xfrm xmlns:a="http://schemas.openxmlformats.org/drawingml/2006/main">
+                            <a:off x="0" y="0"/>
+                            <a:ext cx="3657600" cy="2596896"/>
+                          </a:xfrm>
+                          <a:prstGeom xmlns:a="http://schemas.openxmlformats.org/drawingml/2006/main" prst="rect">
+                            <a:avLst/>
+                          </a:prstGeom>
+                        </pic:spPr>
+                      </pic:pic>
+                    </a:graphicData>
+                  </a:graphic>
                 </wp:inline>
               </w:drawing>
             </w:r>
@@ -5037,24 +5097,39 @@
           </w:tcPr>
           <w:p>
             <w:r>
-              <w:drawing>
-                <wp:inline distT="0" distB="0" distL="0" distR="0">
+              <w:drawing xmlns:w="http://schemas.openxmlformats.org/wordprocessingml/2006/main" xmlns:wp="http://schemas.openxmlformats.org/drawingml/2006/wordprocessingDrawing" xmlns:a="http://schemas.openxmlformats.org/drawingml/2006/main" xmlns:pic="http://schemas.openxmlformats.org/drawingml/2006/picture" xmlns:r="http://schemas.openxmlformats.org/officeDocument/2006/relationships">
+                <wp:inline distT="0" distB="0" distL="114300" distR="114300">
                   <wp:extent cx="3657600" cy="2596896"/>
                   <wp:effectExtent l="0" t="0" r="0" b="0"/>
                   <wp:docPr id="174" name="tc_batch_203.png"/>
-                  <ns2:graphic xmlns:ns2="http://schemas.openxmlformats.org/drawingml/2006/main">
-                    <ns2:graphicData uri="http://schemas.openxmlformats.org/drawingml/2006/picture">
-                      <ns3:pic xmlns:ns3="http://schemas.openxmlformats.org/drawingml/2006/picture">
-                        <ns3:nvPicPr/>
-                        <ns3:blipFill>
-                          <ns2:blip r:embed="rId69"/>
-                        </ns3:blipFill>
-                        <ns3:spPr>
-                          <ns2:xfrm/>
-                        </ns3:spPr>
-                      </ns3:pic>
-                    </ns2:graphicData>
-                  </ns2:graphic>
+                  <wp:cNvGraphicFramePr>
+                    <a:graphicFrameLocks xmlns:a="http://schemas.openxmlformats.org/drawingml/2006/main" noChangeAspect="1"/>
+                  </wp:cNvGraphicFramePr>
+                  <a:graphic xmlns:a="http://schemas.openxmlformats.org/drawingml/2006/main">
+                    <a:graphicData uri="http://schemas.openxmlformats.org/drawingml/2006/picture">
+                      <pic:pic xmlns:pic="http://schemas.openxmlformats.org/drawingml/2006/picture">
+                        <pic:nvPicPr>
+                          <pic:cNvPr id="174" name="tc_batch_203.png"/>
+                          <pic:cNvPicPr/>
+                        </pic:nvPicPr>
+                        <pic:blipFill>
+                          <a:blip xmlns:a="http://schemas.openxmlformats.org/drawingml/2006/main" r:embed="rId69"/>
+                          <a:stretch xmlns:a="http://schemas.openxmlformats.org/drawingml/2006/main">
+                            <a:fillRect/>
+                          </a:stretch>
+                        </pic:blipFill>
+                        <pic:spPr>
+                          <a:xfrm xmlns:a="http://schemas.openxmlformats.org/drawingml/2006/main">
+                            <a:off x="0" y="0"/>
+                            <a:ext cx="3657600" cy="2596896"/>
+                          </a:xfrm>
+                          <a:prstGeom xmlns:a="http://schemas.openxmlformats.org/drawingml/2006/main" prst="rect">
+                            <a:avLst/>
+                          </a:prstGeom>
+                        </pic:spPr>
+                      </pic:pic>
+                    </a:graphicData>
+                  </a:graphic>
                 </wp:inline>
               </w:drawing>
             </w:r>
@@ -5179,24 +5254,39 @@
           </w:tcPr>
           <w:p>
             <w:r>
-              <w:drawing>
-                <wp:inline distT="0" distB="0" distL="0" distR="0">
+              <w:drawing xmlns:w="http://schemas.openxmlformats.org/wordprocessingml/2006/main" xmlns:wp="http://schemas.openxmlformats.org/drawingml/2006/wordprocessingDrawing" xmlns:a="http://schemas.openxmlformats.org/drawingml/2006/main" xmlns:pic="http://schemas.openxmlformats.org/drawingml/2006/picture" xmlns:r="http://schemas.openxmlformats.org/officeDocument/2006/relationships">
+                <wp:inline distT="0" distB="0" distL="114300" distR="114300">
                   <wp:extent cx="3657600" cy="2596896"/>
                   <wp:effectExtent l="0" t="0" r="0" b="0"/>
                   <wp:docPr id="175" name="tc_batch_204.png"/>
-                  <ns2:graphic xmlns:ns2="http://schemas.openxmlformats.org/drawingml/2006/main">
-                    <ns2:graphicData uri="http://schemas.openxmlformats.org/drawingml/2006/picture">
-                      <ns3:pic xmlns:ns3="http://schemas.openxmlformats.org/drawingml/2006/picture">
-                        <ns3:nvPicPr/>
-                        <ns3:blipFill>
-                          <ns2:blip r:embed="rId70"/>
-                        </ns3:blipFill>
-                        <ns3:spPr>
-                          <ns2:xfrm/>
-                        </ns3:spPr>
-                      </ns3:pic>
-                    </ns2:graphicData>
-                  </ns2:graphic>
+                  <wp:cNvGraphicFramePr>
+                    <a:graphicFrameLocks xmlns:a="http://schemas.openxmlformats.org/drawingml/2006/main" noChangeAspect="1"/>
+                  </wp:cNvGraphicFramePr>
+                  <a:graphic xmlns:a="http://schemas.openxmlformats.org/drawingml/2006/main">
+                    <a:graphicData uri="http://schemas.openxmlformats.org/drawingml/2006/picture">
+                      <pic:pic xmlns:pic="http://schemas.openxmlformats.org/drawingml/2006/picture">
+                        <pic:nvPicPr>
+                          <pic:cNvPr id="175" name="tc_batch_204.png"/>
+                          <pic:cNvPicPr/>
+                        </pic:nvPicPr>
+                        <pic:blipFill>
+                          <a:blip xmlns:a="http://schemas.openxmlformats.org/drawingml/2006/main" r:embed="rId70"/>
+                          <a:stretch xmlns:a="http://schemas.openxmlformats.org/drawingml/2006/main">
+                            <a:fillRect/>
+                          </a:stretch>
+                        </pic:blipFill>
+                        <pic:spPr>
+                          <a:xfrm xmlns:a="http://schemas.openxmlformats.org/drawingml/2006/main">
+                            <a:off x="0" y="0"/>
+                            <a:ext cx="3657600" cy="2596896"/>
+                          </a:xfrm>
+                          <a:prstGeom xmlns:a="http://schemas.openxmlformats.org/drawingml/2006/main" prst="rect">
+                            <a:avLst/>
+                          </a:prstGeom>
+                        </pic:spPr>
+                      </pic:pic>
+                    </a:graphicData>
+                  </a:graphic>
                 </wp:inline>
               </w:drawing>
             </w:r>
@@ -5552,24 +5642,39 @@
           </w:tcPr>
           <w:p>
             <w:r>
-              <w:drawing>
-                <wp:inline distT="0" distB="0" distL="0" distR="0">
+              <w:drawing xmlns:w="http://schemas.openxmlformats.org/wordprocessingml/2006/main" xmlns:wp="http://schemas.openxmlformats.org/drawingml/2006/wordprocessingDrawing" xmlns:a="http://schemas.openxmlformats.org/drawingml/2006/main" xmlns:pic="http://schemas.openxmlformats.org/drawingml/2006/picture" xmlns:r="http://schemas.openxmlformats.org/officeDocument/2006/relationships">
+                <wp:inline distT="0" distB="0" distL="114300" distR="114300">
                   <wp:extent cx="3657600" cy="2432304"/>
                   <wp:effectExtent l="0" t="0" r="0" b="0"/>
                   <wp:docPr id="176" name="tc_batch_206.png"/>
-                  <ns2:graphic xmlns:ns2="http://schemas.openxmlformats.org/drawingml/2006/main">
-                    <ns2:graphicData uri="http://schemas.openxmlformats.org/drawingml/2006/picture">
-                      <ns3:pic xmlns:ns3="http://schemas.openxmlformats.org/drawingml/2006/picture">
-                        <ns3:nvPicPr/>
-                        <ns3:blipFill>
-                          <ns2:blip r:embed="rId72"/>
-                        </ns3:blipFill>
-                        <ns3:spPr>
-                          <ns2:xfrm/>
-                        </ns3:spPr>
-                      </ns3:pic>
-                    </ns2:graphicData>
-                  </ns2:graphic>
+                  <wp:cNvGraphicFramePr>
+                    <a:graphicFrameLocks xmlns:a="http://schemas.openxmlformats.org/drawingml/2006/main" noChangeAspect="1"/>
+                  </wp:cNvGraphicFramePr>
+                  <a:graphic xmlns:a="http://schemas.openxmlformats.org/drawingml/2006/main">
+                    <a:graphicData uri="http://schemas.openxmlformats.org/drawingml/2006/picture">
+                      <pic:pic xmlns:pic="http://schemas.openxmlformats.org/drawingml/2006/picture">
+                        <pic:nvPicPr>
+                          <pic:cNvPr id="176" name="tc_batch_206.png"/>
+                          <pic:cNvPicPr/>
+                        </pic:nvPicPr>
+                        <pic:blipFill>
+                          <a:blip xmlns:a="http://schemas.openxmlformats.org/drawingml/2006/main" r:embed="rId72"/>
+                          <a:stretch xmlns:a="http://schemas.openxmlformats.org/drawingml/2006/main">
+                            <a:fillRect/>
+                          </a:stretch>
+                        </pic:blipFill>
+                        <pic:spPr>
+                          <a:xfrm xmlns:a="http://schemas.openxmlformats.org/drawingml/2006/main">
+                            <a:off x="0" y="0"/>
+                            <a:ext cx="3657600" cy="2432304"/>
+                          </a:xfrm>
+                          <a:prstGeom xmlns:a="http://schemas.openxmlformats.org/drawingml/2006/main" prst="rect">
+                            <a:avLst/>
+                          </a:prstGeom>
+                        </pic:spPr>
+                      </pic:pic>
+                    </a:graphicData>
+                  </a:graphic>
                 </wp:inline>
               </w:drawing>
             </w:r>
@@ -5698,24 +5803,39 @@
           </w:tcPr>
           <w:p>
             <w:r>
-              <w:drawing>
-                <wp:inline distT="0" distB="0" distL="0" distR="0">
+              <w:drawing xmlns:w="http://schemas.openxmlformats.org/wordprocessingml/2006/main" xmlns:wp="http://schemas.openxmlformats.org/drawingml/2006/wordprocessingDrawing" xmlns:a="http://schemas.openxmlformats.org/drawingml/2006/main" xmlns:pic="http://schemas.openxmlformats.org/drawingml/2006/picture" xmlns:r="http://schemas.openxmlformats.org/officeDocument/2006/relationships">
+                <wp:inline distT="0" distB="0" distL="114300" distR="114300">
                   <wp:extent cx="3657600" cy="2432304"/>
                   <wp:effectExtent l="0" t="0" r="0" b="0"/>
                   <wp:docPr id="177" name="tc_batch_207.png"/>
-                  <ns2:graphic xmlns:ns2="http://schemas.openxmlformats.org/drawingml/2006/main">
-                    <ns2:graphicData uri="http://schemas.openxmlformats.org/drawingml/2006/picture">
-                      <ns3:pic xmlns:ns3="http://schemas.openxmlformats.org/drawingml/2006/picture">
-                        <ns3:nvPicPr/>
-                        <ns3:blipFill>
-                          <ns2:blip r:embed="rId73"/>
-                        </ns3:blipFill>
-                        <ns3:spPr>
-                          <ns2:xfrm/>
-                        </ns3:spPr>
-                      </ns3:pic>
-                    </ns2:graphicData>
-                  </ns2:graphic>
+                  <wp:cNvGraphicFramePr>
+                    <a:graphicFrameLocks xmlns:a="http://schemas.openxmlformats.org/drawingml/2006/main" noChangeAspect="1"/>
+                  </wp:cNvGraphicFramePr>
+                  <a:graphic xmlns:a="http://schemas.openxmlformats.org/drawingml/2006/main">
+                    <a:graphicData uri="http://schemas.openxmlformats.org/drawingml/2006/picture">
+                      <pic:pic xmlns:pic="http://schemas.openxmlformats.org/drawingml/2006/picture">
+                        <pic:nvPicPr>
+                          <pic:cNvPr id="177" name="tc_batch_207.png"/>
+                          <pic:cNvPicPr/>
+                        </pic:nvPicPr>
+                        <pic:blipFill>
+                          <a:blip xmlns:a="http://schemas.openxmlformats.org/drawingml/2006/main" r:embed="rId73"/>
+                          <a:stretch xmlns:a="http://schemas.openxmlformats.org/drawingml/2006/main">
+                            <a:fillRect/>
+                          </a:stretch>
+                        </pic:blipFill>
+                        <pic:spPr>
+                          <a:xfrm xmlns:a="http://schemas.openxmlformats.org/drawingml/2006/main">
+                            <a:off x="0" y="0"/>
+                            <a:ext cx="3657600" cy="2432304"/>
+                          </a:xfrm>
+                          <a:prstGeom xmlns:a="http://schemas.openxmlformats.org/drawingml/2006/main" prst="rect">
+                            <a:avLst/>
+                          </a:prstGeom>
+                        </pic:spPr>
+                      </pic:pic>
+                    </a:graphicData>
+                  </a:graphic>
                 </wp:inline>
               </w:drawing>
             </w:r>
@@ -5843,24 +5963,39 @@
           </w:tcPr>
           <w:p>
             <w:r>
-              <w:drawing>
-                <wp:inline distT="0" distB="0" distL="0" distR="0">
+              <w:drawing xmlns:w="http://schemas.openxmlformats.org/wordprocessingml/2006/main" xmlns:wp="http://schemas.openxmlformats.org/drawingml/2006/wordprocessingDrawing" xmlns:a="http://schemas.openxmlformats.org/drawingml/2006/main" xmlns:pic="http://schemas.openxmlformats.org/drawingml/2006/picture" xmlns:r="http://schemas.openxmlformats.org/officeDocument/2006/relationships">
+                <wp:inline distT="0" distB="0" distL="114300" distR="114300">
                   <wp:extent cx="3657600" cy="2596896"/>
                   <wp:effectExtent l="0" t="0" r="0" b="0"/>
                   <wp:docPr id="178" name="tc_batch_205.png"/>
-                  <ns2:graphic xmlns:ns2="http://schemas.openxmlformats.org/drawingml/2006/main">
-                    <ns2:graphicData uri="http://schemas.openxmlformats.org/drawingml/2006/picture">
-                      <ns3:pic xmlns:ns3="http://schemas.openxmlformats.org/drawingml/2006/picture">
-                        <ns3:nvPicPr/>
-                        <ns3:blipFill>
-                          <ns2:blip r:embed="rId71"/>
-                        </ns3:blipFill>
-                        <ns3:spPr>
-                          <ns2:xfrm/>
-                        </ns3:spPr>
-                      </ns3:pic>
-                    </ns2:graphicData>
-                  </ns2:graphic>
+                  <wp:cNvGraphicFramePr>
+                    <a:graphicFrameLocks xmlns:a="http://schemas.openxmlformats.org/drawingml/2006/main" noChangeAspect="1"/>
+                  </wp:cNvGraphicFramePr>
+                  <a:graphic xmlns:a="http://schemas.openxmlformats.org/drawingml/2006/main">
+                    <a:graphicData uri="http://schemas.openxmlformats.org/drawingml/2006/picture">
+                      <pic:pic xmlns:pic="http://schemas.openxmlformats.org/drawingml/2006/picture">
+                        <pic:nvPicPr>
+                          <pic:cNvPr id="178" name="tc_batch_205.png"/>
+                          <pic:cNvPicPr/>
+                        </pic:nvPicPr>
+                        <pic:blipFill>
+                          <a:blip xmlns:a="http://schemas.openxmlformats.org/drawingml/2006/main" r:embed="rId71"/>
+                          <a:stretch xmlns:a="http://schemas.openxmlformats.org/drawingml/2006/main">
+                            <a:fillRect/>
+                          </a:stretch>
+                        </pic:blipFill>
+                        <pic:spPr>
+                          <a:xfrm xmlns:a="http://schemas.openxmlformats.org/drawingml/2006/main">
+                            <a:off x="0" y="0"/>
+                            <a:ext cx="3657600" cy="2596896"/>
+                          </a:xfrm>
+                          <a:prstGeom xmlns:a="http://schemas.openxmlformats.org/drawingml/2006/main" prst="rect">
+                            <a:avLst/>
+                          </a:prstGeom>
+                        </pic:spPr>
+                      </pic:pic>
+                    </a:graphicData>
+                  </a:graphic>
                 </wp:inline>
               </w:drawing>
             </w:r>
@@ -5979,24 +6114,39 @@
           </w:tcPr>
           <w:p>
             <w:r>
-              <w:drawing>
-                <wp:inline distT="0" distB="0" distL="0" distR="0">
+              <w:drawing xmlns:w="http://schemas.openxmlformats.org/wordprocessingml/2006/main" xmlns:wp="http://schemas.openxmlformats.org/drawingml/2006/wordprocessingDrawing" xmlns:a="http://schemas.openxmlformats.org/drawingml/2006/main" xmlns:pic="http://schemas.openxmlformats.org/drawingml/2006/picture" xmlns:r="http://schemas.openxmlformats.org/officeDocument/2006/relationships">
+                <wp:inline distT="0" distB="0" distL="114300" distR="114300">
                   <wp:extent cx="3657600" cy="2596896"/>
                   <wp:effectExtent l="0" t="0" r="0" b="0"/>
                   <wp:docPr id="179" name="tc_batch_214.png"/>
-                  <ns2:graphic xmlns:ns2="http://schemas.openxmlformats.org/drawingml/2006/main">
-                    <ns2:graphicData uri="http://schemas.openxmlformats.org/drawingml/2006/picture">
-                      <ns3:pic xmlns:ns3="http://schemas.openxmlformats.org/drawingml/2006/picture">
-                        <ns3:nvPicPr/>
-                        <ns3:blipFill>
-                          <ns2:blip r:embed="rId80"/>
-                        </ns3:blipFill>
-                        <ns3:spPr>
-                          <ns2:xfrm/>
-                        </ns3:spPr>
-                      </ns3:pic>
-                    </ns2:graphicData>
-                  </ns2:graphic>
+                  <wp:cNvGraphicFramePr>
+                    <a:graphicFrameLocks xmlns:a="http://schemas.openxmlformats.org/drawingml/2006/main" noChangeAspect="1"/>
+                  </wp:cNvGraphicFramePr>
+                  <a:graphic xmlns:a="http://schemas.openxmlformats.org/drawingml/2006/main">
+                    <a:graphicData uri="http://schemas.openxmlformats.org/drawingml/2006/picture">
+                      <pic:pic xmlns:pic="http://schemas.openxmlformats.org/drawingml/2006/picture">
+                        <pic:nvPicPr>
+                          <pic:cNvPr id="179" name="tc_batch_214.png"/>
+                          <pic:cNvPicPr/>
+                        </pic:nvPicPr>
+                        <pic:blipFill>
+                          <a:blip xmlns:a="http://schemas.openxmlformats.org/drawingml/2006/main" r:embed="rId80"/>
+                          <a:stretch xmlns:a="http://schemas.openxmlformats.org/drawingml/2006/main">
+                            <a:fillRect/>
+                          </a:stretch>
+                        </pic:blipFill>
+                        <pic:spPr>
+                          <a:xfrm xmlns:a="http://schemas.openxmlformats.org/drawingml/2006/main">
+                            <a:off x="0" y="0"/>
+                            <a:ext cx="3657600" cy="2596896"/>
+                          </a:xfrm>
+                          <a:prstGeom xmlns:a="http://schemas.openxmlformats.org/drawingml/2006/main" prst="rect">
+                            <a:avLst/>
+                          </a:prstGeom>
+                        </pic:spPr>
+                      </pic:pic>
+                    </a:graphicData>
+                  </a:graphic>
                 </wp:inline>
               </w:drawing>
             </w:r>
@@ -6105,24 +6255,39 @@
           </w:tcPr>
           <w:p>
             <w:r>
-              <w:drawing>
-                <wp:inline distT="0" distB="0" distL="0" distR="0">
+              <w:drawing xmlns:w="http://schemas.openxmlformats.org/wordprocessingml/2006/main" xmlns:wp="http://schemas.openxmlformats.org/drawingml/2006/wordprocessingDrawing" xmlns:a="http://schemas.openxmlformats.org/drawingml/2006/main" xmlns:pic="http://schemas.openxmlformats.org/drawingml/2006/picture" xmlns:r="http://schemas.openxmlformats.org/officeDocument/2006/relationships">
+                <wp:inline distT="0" distB="0" distL="114300" distR="114300">
                   <wp:extent cx="3657600" cy="2596896"/>
                   <wp:effectExtent l="0" t="0" r="0" b="0"/>
                   <wp:docPr id="180" name="tc_batch_215.png"/>
-                  <ns2:graphic xmlns:ns2="http://schemas.openxmlformats.org/drawingml/2006/main">
-                    <ns2:graphicData uri="http://schemas.openxmlformats.org/drawingml/2006/picture">
-                      <ns3:pic xmlns:ns3="http://schemas.openxmlformats.org/drawingml/2006/picture">
-                        <ns3:nvPicPr/>
-                        <ns3:blipFill>
-                          <ns2:blip r:embed="rId81"/>
-                        </ns3:blipFill>
-                        <ns3:spPr>
-                          <ns2:xfrm/>
-                        </ns3:spPr>
-                      </ns3:pic>
-                    </ns2:graphicData>
-                  </ns2:graphic>
+                  <wp:cNvGraphicFramePr>
+                    <a:graphicFrameLocks xmlns:a="http://schemas.openxmlformats.org/drawingml/2006/main" noChangeAspect="1"/>
+                  </wp:cNvGraphicFramePr>
+                  <a:graphic xmlns:a="http://schemas.openxmlformats.org/drawingml/2006/main">
+                    <a:graphicData uri="http://schemas.openxmlformats.org/drawingml/2006/picture">
+                      <pic:pic xmlns:pic="http://schemas.openxmlformats.org/drawingml/2006/picture">
+                        <pic:nvPicPr>
+                          <pic:cNvPr id="180" name="tc_batch_215.png"/>
+                          <pic:cNvPicPr/>
+                        </pic:nvPicPr>
+                        <pic:blipFill>
+                          <a:blip xmlns:a="http://schemas.openxmlformats.org/drawingml/2006/main" r:embed="rId81"/>
+                          <a:stretch xmlns:a="http://schemas.openxmlformats.org/drawingml/2006/main">
+                            <a:fillRect/>
+                          </a:stretch>
+                        </pic:blipFill>
+                        <pic:spPr>
+                          <a:xfrm xmlns:a="http://schemas.openxmlformats.org/drawingml/2006/main">
+                            <a:off x="0" y="0"/>
+                            <a:ext cx="3657600" cy="2596896"/>
+                          </a:xfrm>
+                          <a:prstGeom xmlns:a="http://schemas.openxmlformats.org/drawingml/2006/main" prst="rect">
+                            <a:avLst/>
+                          </a:prstGeom>
+                        </pic:spPr>
+                      </pic:pic>
+                    </a:graphicData>
+                  </a:graphic>
                 </wp:inline>
               </w:drawing>
             </w:r>
@@ -6245,24 +6410,39 @@
           </w:tcPr>
           <w:p>
             <w:r>
-              <w:drawing>
-                <wp:inline distT="0" distB="0" distL="0" distR="0">
+              <w:drawing xmlns:w="http://schemas.openxmlformats.org/wordprocessingml/2006/main" xmlns:wp="http://schemas.openxmlformats.org/drawingml/2006/wordprocessingDrawing" xmlns:a="http://schemas.openxmlformats.org/drawingml/2006/main" xmlns:pic="http://schemas.openxmlformats.org/drawingml/2006/picture" xmlns:r="http://schemas.openxmlformats.org/officeDocument/2006/relationships">
+                <wp:inline distT="0" distB="0" distL="114300" distR="114300">
                   <wp:extent cx="3657600" cy="2596896"/>
                   <wp:effectExtent l="0" t="0" r="0" b="0"/>
                   <wp:docPr id="181" name="tc_batch_216.png"/>
-                  <ns2:graphic xmlns:ns2="http://schemas.openxmlformats.org/drawingml/2006/main">
-                    <ns2:graphicData uri="http://schemas.openxmlformats.org/drawingml/2006/picture">
-                      <ns3:pic xmlns:ns3="http://schemas.openxmlformats.org/drawingml/2006/picture">
-                        <ns3:nvPicPr/>
-                        <ns3:blipFill>
-                          <ns2:blip r:embed="rId82"/>
-                        </ns3:blipFill>
-                        <ns3:spPr>
-                          <ns2:xfrm/>
-                        </ns3:spPr>
-                      </ns3:pic>
-                    </ns2:graphicData>
-                  </ns2:graphic>
+                  <wp:cNvGraphicFramePr>
+                    <a:graphicFrameLocks xmlns:a="http://schemas.openxmlformats.org/drawingml/2006/main" noChangeAspect="1"/>
+                  </wp:cNvGraphicFramePr>
+                  <a:graphic xmlns:a="http://schemas.openxmlformats.org/drawingml/2006/main">
+                    <a:graphicData uri="http://schemas.openxmlformats.org/drawingml/2006/picture">
+                      <pic:pic xmlns:pic="http://schemas.openxmlformats.org/drawingml/2006/picture">
+                        <pic:nvPicPr>
+                          <pic:cNvPr id="181" name="tc_batch_216.png"/>
+                          <pic:cNvPicPr/>
+                        </pic:nvPicPr>
+                        <pic:blipFill>
+                          <a:blip xmlns:a="http://schemas.openxmlformats.org/drawingml/2006/main" r:embed="rId82"/>
+                          <a:stretch xmlns:a="http://schemas.openxmlformats.org/drawingml/2006/main">
+                            <a:fillRect/>
+                          </a:stretch>
+                        </pic:blipFill>
+                        <pic:spPr>
+                          <a:xfrm xmlns:a="http://schemas.openxmlformats.org/drawingml/2006/main">
+                            <a:off x="0" y="0"/>
+                            <a:ext cx="3657600" cy="2596896"/>
+                          </a:xfrm>
+                          <a:prstGeom xmlns:a="http://schemas.openxmlformats.org/drawingml/2006/main" prst="rect">
+                            <a:avLst/>
+                          </a:prstGeom>
+                        </pic:spPr>
+                      </pic:pic>
+                    </a:graphicData>
+                  </a:graphic>
                 </wp:inline>
               </w:drawing>
             </w:r>
@@ -11350,24 +11530,39 @@
           </w:tcPr>
           <w:p>
             <w:r>
-              <w:drawing>
-                <wp:inline distT="0" distB="0" distL="0" distR="0">
+              <w:drawing xmlns:w="http://schemas.openxmlformats.org/wordprocessingml/2006/main" xmlns:wp="http://schemas.openxmlformats.org/drawingml/2006/wordprocessingDrawing" xmlns:a="http://schemas.openxmlformats.org/drawingml/2006/main" xmlns:pic="http://schemas.openxmlformats.org/drawingml/2006/picture" xmlns:r="http://schemas.openxmlformats.org/officeDocument/2006/relationships">
+                <wp:inline distT="0" distB="0" distL="114300" distR="114300">
                   <wp:extent cx="3657600" cy="3090672"/>
                   <wp:effectExtent l="0" t="0" r="0" b="0"/>
                   <wp:docPr id="182" name="tc_batch_208.png"/>
-                  <ns2:graphic xmlns:ns2="http://schemas.openxmlformats.org/drawingml/2006/main">
-                    <ns2:graphicData uri="http://schemas.openxmlformats.org/drawingml/2006/picture">
-                      <ns3:pic xmlns:ns3="http://schemas.openxmlformats.org/drawingml/2006/picture">
-                        <ns3:nvPicPr/>
-                        <ns3:blipFill>
-                          <ns2:blip r:embed="rId74"/>
-                        </ns3:blipFill>
-                        <ns3:spPr>
-                          <ns2:xfrm/>
-                        </ns3:spPr>
-                      </ns3:pic>
-                    </ns2:graphicData>
-                  </ns2:graphic>
+                  <wp:cNvGraphicFramePr>
+                    <a:graphicFrameLocks xmlns:a="http://schemas.openxmlformats.org/drawingml/2006/main" noChangeAspect="1"/>
+                  </wp:cNvGraphicFramePr>
+                  <a:graphic xmlns:a="http://schemas.openxmlformats.org/drawingml/2006/main">
+                    <a:graphicData uri="http://schemas.openxmlformats.org/drawingml/2006/picture">
+                      <pic:pic xmlns:pic="http://schemas.openxmlformats.org/drawingml/2006/picture">
+                        <pic:nvPicPr>
+                          <pic:cNvPr id="182" name="tc_batch_208.png"/>
+                          <pic:cNvPicPr/>
+                        </pic:nvPicPr>
+                        <pic:blipFill>
+                          <a:blip xmlns:a="http://schemas.openxmlformats.org/drawingml/2006/main" r:embed="rId74"/>
+                          <a:stretch xmlns:a="http://schemas.openxmlformats.org/drawingml/2006/main">
+                            <a:fillRect/>
+                          </a:stretch>
+                        </pic:blipFill>
+                        <pic:spPr>
+                          <a:xfrm xmlns:a="http://schemas.openxmlformats.org/drawingml/2006/main">
+                            <a:off x="0" y="0"/>
+                            <a:ext cx="3657600" cy="3090672"/>
+                          </a:xfrm>
+                          <a:prstGeom xmlns:a="http://schemas.openxmlformats.org/drawingml/2006/main" prst="rect">
+                            <a:avLst/>
+                          </a:prstGeom>
+                        </pic:spPr>
+                      </pic:pic>
+                    </a:graphicData>
+                  </a:graphic>
                 </wp:inline>
               </w:drawing>
             </w:r>
@@ -11612,24 +11807,39 @@
           </w:tcPr>
           <w:p>
             <w:r>
-              <w:drawing>
-                <wp:inline distT="0" distB="0" distL="0" distR="0">
+              <w:drawing xmlns:w="http://schemas.openxmlformats.org/wordprocessingml/2006/main" xmlns:wp="http://schemas.openxmlformats.org/drawingml/2006/wordprocessingDrawing" xmlns:a="http://schemas.openxmlformats.org/drawingml/2006/main" xmlns:pic="http://schemas.openxmlformats.org/drawingml/2006/picture" xmlns:r="http://schemas.openxmlformats.org/officeDocument/2006/relationships">
+                <wp:inline distT="0" distB="0" distL="114300" distR="114300">
                   <wp:extent cx="3657600" cy="3255264"/>
                   <wp:effectExtent l="0" t="0" r="0" b="0"/>
                   <wp:docPr id="183" name="tc_batch_209.png"/>
-                  <ns2:graphic xmlns:ns2="http://schemas.openxmlformats.org/drawingml/2006/main">
-                    <ns2:graphicData uri="http://schemas.openxmlformats.org/drawingml/2006/picture">
-                      <ns3:pic xmlns:ns3="http://schemas.openxmlformats.org/drawingml/2006/picture">
-                        <ns3:nvPicPr/>
-                        <ns3:blipFill>
-                          <ns2:blip r:embed="rId75"/>
-                        </ns3:blipFill>
-                        <ns3:spPr>
-                          <ns2:xfrm/>
-                        </ns3:spPr>
-                      </ns3:pic>
-                    </ns2:graphicData>
-                  </ns2:graphic>
+                  <wp:cNvGraphicFramePr>
+                    <a:graphicFrameLocks xmlns:a="http://schemas.openxmlformats.org/drawingml/2006/main" noChangeAspect="1"/>
+                  </wp:cNvGraphicFramePr>
+                  <a:graphic xmlns:a="http://schemas.openxmlformats.org/drawingml/2006/main">
+                    <a:graphicData uri="http://schemas.openxmlformats.org/drawingml/2006/picture">
+                      <pic:pic xmlns:pic="http://schemas.openxmlformats.org/drawingml/2006/picture">
+                        <pic:nvPicPr>
+                          <pic:cNvPr id="183" name="tc_batch_209.png"/>
+                          <pic:cNvPicPr/>
+                        </pic:nvPicPr>
+                        <pic:blipFill>
+                          <a:blip xmlns:a="http://schemas.openxmlformats.org/drawingml/2006/main" r:embed="rId75"/>
+                          <a:stretch xmlns:a="http://schemas.openxmlformats.org/drawingml/2006/main">
+                            <a:fillRect/>
+                          </a:stretch>
+                        </pic:blipFill>
+                        <pic:spPr>
+                          <a:xfrm xmlns:a="http://schemas.openxmlformats.org/drawingml/2006/main">
+                            <a:off x="0" y="0"/>
+                            <a:ext cx="3657600" cy="3255264"/>
+                          </a:xfrm>
+                          <a:prstGeom xmlns:a="http://schemas.openxmlformats.org/drawingml/2006/main" prst="rect">
+                            <a:avLst/>
+                          </a:prstGeom>
+                        </pic:spPr>
+                      </pic:pic>
+                    </a:graphicData>
+                  </a:graphic>
                 </wp:inline>
               </w:drawing>
             </w:r>
@@ -11749,24 +11959,39 @@
           </w:tcPr>
           <w:p>
             <w:r>
-              <w:drawing>
-                <wp:inline distT="0" distB="0" distL="0" distR="0">
+              <w:drawing xmlns:w="http://schemas.openxmlformats.org/wordprocessingml/2006/main" xmlns:wp="http://schemas.openxmlformats.org/drawingml/2006/wordprocessingDrawing" xmlns:a="http://schemas.openxmlformats.org/drawingml/2006/main" xmlns:pic="http://schemas.openxmlformats.org/drawingml/2006/picture" xmlns:r="http://schemas.openxmlformats.org/officeDocument/2006/relationships">
+                <wp:inline distT="0" distB="0" distL="114300" distR="114300">
                   <wp:extent cx="3657600" cy="3337560"/>
                   <wp:effectExtent l="0" t="0" r="0" b="0"/>
                   <wp:docPr id="184" name="tc_batch_210.png"/>
-                  <ns2:graphic xmlns:ns2="http://schemas.openxmlformats.org/drawingml/2006/main">
-                    <ns2:graphicData uri="http://schemas.openxmlformats.org/drawingml/2006/picture">
-                      <ns3:pic xmlns:ns3="http://schemas.openxmlformats.org/drawingml/2006/picture">
-                        <ns3:nvPicPr/>
-                        <ns3:blipFill>
-                          <ns2:blip r:embed="rId76"/>
-                        </ns3:blipFill>
-                        <ns3:spPr>
-                          <ns2:xfrm/>
-                        </ns3:spPr>
-                      </ns3:pic>
-                    </ns2:graphicData>
-                  </ns2:graphic>
+                  <wp:cNvGraphicFramePr>
+                    <a:graphicFrameLocks xmlns:a="http://schemas.openxmlformats.org/drawingml/2006/main" noChangeAspect="1"/>
+                  </wp:cNvGraphicFramePr>
+                  <a:graphic xmlns:a="http://schemas.openxmlformats.org/drawingml/2006/main">
+                    <a:graphicData uri="http://schemas.openxmlformats.org/drawingml/2006/picture">
+                      <pic:pic xmlns:pic="http://schemas.openxmlformats.org/drawingml/2006/picture">
+                        <pic:nvPicPr>
+                          <pic:cNvPr id="184" name="tc_batch_210.png"/>
+                          <pic:cNvPicPr/>
+                        </pic:nvPicPr>
+                        <pic:blipFill>
+                          <a:blip xmlns:a="http://schemas.openxmlformats.org/drawingml/2006/main" r:embed="rId76"/>
+                          <a:stretch xmlns:a="http://schemas.openxmlformats.org/drawingml/2006/main">
+                            <a:fillRect/>
+                          </a:stretch>
+                        </pic:blipFill>
+                        <pic:spPr>
+                          <a:xfrm xmlns:a="http://schemas.openxmlformats.org/drawingml/2006/main">
+                            <a:off x="0" y="0"/>
+                            <a:ext cx="3657600" cy="3337560"/>
+                          </a:xfrm>
+                          <a:prstGeom xmlns:a="http://schemas.openxmlformats.org/drawingml/2006/main" prst="rect">
+                            <a:avLst/>
+                          </a:prstGeom>
+                        </pic:spPr>
+                      </pic:pic>
+                    </a:graphicData>
+                  </a:graphic>
                 </wp:inline>
               </w:drawing>
             </w:r>
@@ -11890,24 +12115,39 @@
           </w:tcPr>
           <w:p>
             <w:r>
-              <w:drawing>
-                <wp:inline distT="0" distB="0" distL="0" distR="0">
+              <w:drawing xmlns:w="http://schemas.openxmlformats.org/wordprocessingml/2006/main" xmlns:wp="http://schemas.openxmlformats.org/drawingml/2006/wordprocessingDrawing" xmlns:a="http://schemas.openxmlformats.org/drawingml/2006/main" xmlns:pic="http://schemas.openxmlformats.org/drawingml/2006/picture" xmlns:r="http://schemas.openxmlformats.org/officeDocument/2006/relationships">
+                <wp:inline distT="0" distB="0" distL="114300" distR="114300">
                   <wp:extent cx="3657600" cy="3255264"/>
                   <wp:effectExtent l="0" t="0" r="0" b="0"/>
                   <wp:docPr id="185" name="tc_batch_211.png"/>
-                  <ns2:graphic xmlns:ns2="http://schemas.openxmlformats.org/drawingml/2006/main">
-                    <ns2:graphicData uri="http://schemas.openxmlformats.org/drawingml/2006/picture">
-                      <ns3:pic xmlns:ns3="http://schemas.openxmlformats.org/drawingml/2006/picture">
-                        <ns3:nvPicPr/>
-                        <ns3:blipFill>
-                          <ns2:blip r:embed="rId77"/>
-                        </ns3:blipFill>
-                        <ns3:spPr>
-                          <ns2:xfrm/>
-                        </ns3:spPr>
-                      </ns3:pic>
-                    </ns2:graphicData>
-                  </ns2:graphic>
+                  <wp:cNvGraphicFramePr>
+                    <a:graphicFrameLocks xmlns:a="http://schemas.openxmlformats.org/drawingml/2006/main" noChangeAspect="1"/>
+                  </wp:cNvGraphicFramePr>
+                  <a:graphic xmlns:a="http://schemas.openxmlformats.org/drawingml/2006/main">
+                    <a:graphicData uri="http://schemas.openxmlformats.org/drawingml/2006/picture">
+                      <pic:pic xmlns:pic="http://schemas.openxmlformats.org/drawingml/2006/picture">
+                        <pic:nvPicPr>
+                          <pic:cNvPr id="185" name="tc_batch_211.png"/>
+                          <pic:cNvPicPr/>
+                        </pic:nvPicPr>
+                        <pic:blipFill>
+                          <a:blip xmlns:a="http://schemas.openxmlformats.org/drawingml/2006/main" r:embed="rId77"/>
+                          <a:stretch xmlns:a="http://schemas.openxmlformats.org/drawingml/2006/main">
+                            <a:fillRect/>
+                          </a:stretch>
+                        </pic:blipFill>
+                        <pic:spPr>
+                          <a:xfrm xmlns:a="http://schemas.openxmlformats.org/drawingml/2006/main">
+                            <a:off x="0" y="0"/>
+                            <a:ext cx="3657600" cy="3255264"/>
+                          </a:xfrm>
+                          <a:prstGeom xmlns:a="http://schemas.openxmlformats.org/drawingml/2006/main" prst="rect">
+                            <a:avLst/>
+                          </a:prstGeom>
+                        </pic:spPr>
+                      </pic:pic>
+                    </a:graphicData>
+                  </a:graphic>
                 </wp:inline>
               </w:drawing>
             </w:r>
@@ -13527,24 +13767,39 @@
           </w:tcPr>
           <w:p>
             <w:r>
-              <w:drawing>
-                <wp:inline distT="0" distB="0" distL="0" distR="0">
+              <w:drawing xmlns:w="http://schemas.openxmlformats.org/wordprocessingml/2006/main" xmlns:wp="http://schemas.openxmlformats.org/drawingml/2006/wordprocessingDrawing" xmlns:a="http://schemas.openxmlformats.org/drawingml/2006/main" xmlns:pic="http://schemas.openxmlformats.org/drawingml/2006/picture" xmlns:r="http://schemas.openxmlformats.org/officeDocument/2006/relationships">
+                <wp:inline distT="0" distB="0" distL="114300" distR="114300">
                   <wp:extent cx="3657600" cy="2926080"/>
                   <wp:effectExtent l="0" t="0" r="0" b="0"/>
                   <wp:docPr id="186" name="tc_batch_212.png"/>
-                  <ns2:graphic xmlns:ns2="http://schemas.openxmlformats.org/drawingml/2006/main">
-                    <ns2:graphicData uri="http://schemas.openxmlformats.org/drawingml/2006/picture">
-                      <ns3:pic xmlns:ns3="http://schemas.openxmlformats.org/drawingml/2006/picture">
-                        <ns3:nvPicPr/>
-                        <ns3:blipFill>
-                          <ns2:blip r:embed="rId78"/>
-                        </ns3:blipFill>
-                        <ns3:spPr>
-                          <ns2:xfrm/>
-                        </ns3:spPr>
-                      </ns3:pic>
-                    </ns2:graphicData>
-                  </ns2:graphic>
+                  <wp:cNvGraphicFramePr>
+                    <a:graphicFrameLocks xmlns:a="http://schemas.openxmlformats.org/drawingml/2006/main" noChangeAspect="1"/>
+                  </wp:cNvGraphicFramePr>
+                  <a:graphic xmlns:a="http://schemas.openxmlformats.org/drawingml/2006/main">
+                    <a:graphicData uri="http://schemas.openxmlformats.org/drawingml/2006/picture">
+                      <pic:pic xmlns:pic="http://schemas.openxmlformats.org/drawingml/2006/picture">
+                        <pic:nvPicPr>
+                          <pic:cNvPr id="186" name="tc_batch_212.png"/>
+                          <pic:cNvPicPr/>
+                        </pic:nvPicPr>
+                        <pic:blipFill>
+                          <a:blip xmlns:a="http://schemas.openxmlformats.org/drawingml/2006/main" r:embed="rId78"/>
+                          <a:stretch xmlns:a="http://schemas.openxmlformats.org/drawingml/2006/main">
+                            <a:fillRect/>
+                          </a:stretch>
+                        </pic:blipFill>
+                        <pic:spPr>
+                          <a:xfrm xmlns:a="http://schemas.openxmlformats.org/drawingml/2006/main">
+                            <a:off x="0" y="0"/>
+                            <a:ext cx="3657600" cy="2926080"/>
+                          </a:xfrm>
+                          <a:prstGeom xmlns:a="http://schemas.openxmlformats.org/drawingml/2006/main" prst="rect">
+                            <a:avLst/>
+                          </a:prstGeom>
+                        </pic:spPr>
+                      </pic:pic>
+                    </a:graphicData>
+                  </a:graphic>
                 </wp:inline>
               </w:drawing>
             </w:r>
@@ -13668,24 +13923,39 @@
           </w:tcPr>
           <w:p>
             <w:r>
-              <w:drawing>
-                <wp:inline distT="0" distB="0" distL="0" distR="0">
+              <w:drawing xmlns:w="http://schemas.openxmlformats.org/wordprocessingml/2006/main" xmlns:wp="http://schemas.openxmlformats.org/drawingml/2006/wordprocessingDrawing" xmlns:a="http://schemas.openxmlformats.org/drawingml/2006/main" xmlns:pic="http://schemas.openxmlformats.org/drawingml/2006/picture" xmlns:r="http://schemas.openxmlformats.org/officeDocument/2006/relationships">
+                <wp:inline distT="0" distB="0" distL="114300" distR="114300">
                   <wp:extent cx="3657600" cy="2926080"/>
                   <wp:effectExtent l="0" t="0" r="0" b="0"/>
                   <wp:docPr id="187" name="tc_batch_213.png"/>
-                  <ns2:graphic xmlns:ns2="http://schemas.openxmlformats.org/drawingml/2006/main">
-                    <ns2:graphicData uri="http://schemas.openxmlformats.org/drawingml/2006/picture">
-                      <ns3:pic xmlns:ns3="http://schemas.openxmlformats.org/drawingml/2006/picture">
-                        <ns3:nvPicPr/>
-                        <ns3:blipFill>
-                          <ns2:blip r:embed="rId79"/>
-                        </ns3:blipFill>
-                        <ns3:spPr>
-                          <ns2:xfrm/>
-                        </ns3:spPr>
-                      </ns3:pic>
-                    </ns2:graphicData>
-                  </ns2:graphic>
+                  <wp:cNvGraphicFramePr>
+                    <a:graphicFrameLocks xmlns:a="http://schemas.openxmlformats.org/drawingml/2006/main" noChangeAspect="1"/>
+                  </wp:cNvGraphicFramePr>
+                  <a:graphic xmlns:a="http://schemas.openxmlformats.org/drawingml/2006/main">
+                    <a:graphicData uri="http://schemas.openxmlformats.org/drawingml/2006/picture">
+                      <pic:pic xmlns:pic="http://schemas.openxmlformats.org/drawingml/2006/picture">
+                        <pic:nvPicPr>
+                          <pic:cNvPr id="187" name="tc_batch_213.png"/>
+                          <pic:cNvPicPr/>
+                        </pic:nvPicPr>
+                        <pic:blipFill>
+                          <a:blip xmlns:a="http://schemas.openxmlformats.org/drawingml/2006/main" r:embed="rId79"/>
+                          <a:stretch xmlns:a="http://schemas.openxmlformats.org/drawingml/2006/main">
+                            <a:fillRect/>
+                          </a:stretch>
+                        </pic:blipFill>
+                        <pic:spPr>
+                          <a:xfrm xmlns:a="http://schemas.openxmlformats.org/drawingml/2006/main">
+                            <a:off x="0" y="0"/>
+                            <a:ext cx="3657600" cy="2926080"/>
+                          </a:xfrm>
+                          <a:prstGeom xmlns:a="http://schemas.openxmlformats.org/drawingml/2006/main" prst="rect">
+                            <a:avLst/>
+                          </a:prstGeom>
+                        </pic:spPr>
+                      </pic:pic>
+                    </a:graphicData>
+                  </a:graphic>
                 </wp:inline>
               </w:drawing>
             </w:r>

</xml_diff>

<commit_message>
docs: TC 5.5-11 추가 - colleges.txt 행 형식 오류 시 오류 출력 및 종료
Co-Authored-By: Claude Sonnet 4.6 <noreply@anthropic.com>
</commit_message>
<xml_diff>
--- a/발표준비/B04_보고서_최종.docx
+++ b/발표준비/B04_보고서_최종.docx
@@ -3415,6 +3415,135 @@
                   </a:graphic>
                 </wp:inline>
               </w:drawing>
+            </w:r>
+          </w:p>
+        </w:tc>
+      </w:tr>
+      <w:tr>
+        <w:tc>
+          <w:tcPr>
+            <w:tcW w:w="900" w:type="dxa"/>
+            <w:tcBorders>
+              <w:top w:val="single" w:sz="1" w:space="0" w:color="AAAAAA"/>
+              <w:left w:val="single" w:sz="1" w:space="0" w:color="AAAAAA"/>
+              <w:bottom w:val="single" w:sz="1" w:space="0" w:color="AAAAAA"/>
+              <w:right w:val="single" w:sz="1" w:space="0" w:color="AAAAAA"/>
+            </w:tcBorders>
+            <w:tcMar>
+              <w:top w:w="80" w:type="dxa"/>
+              <w:left w:w="120" w:type="dxa"/>
+              <w:bottom w:w="80" w:type="dxa"/>
+              <w:right w:w="120" w:type="dxa"/>
+            </w:tcMar>
+          </w:tcPr>
+          <w:p>
+            <w:r>
+              <w:rPr>
+                <w:b/>
+                <w:bCs/>
+                <w:sz w:val="18"/>
+                <w:szCs w:val="18"/>
+              </w:rPr>
+              <w:t>5.5-11</w:t>
+            </w:r>
+          </w:p>
+        </w:tc>
+        <w:tc>
+          <w:tcPr>
+            <w:tcW w:w="3800" w:type="dxa"/>
+            <w:tcBorders>
+              <w:top w:val="single" w:sz="1" w:space="0" w:color="AAAAAA"/>
+              <w:left w:val="single" w:sz="1" w:space="0" w:color="AAAAAA"/>
+              <w:bottom w:val="single" w:sz="1" w:space="0" w:color="AAAAAA"/>
+              <w:right w:val="single" w:sz="1" w:space="0" w:color="AAAAAA"/>
+            </w:tcBorders>
+            <w:tcMar>
+              <w:top w:w="80" w:type="dxa"/>
+              <w:left w:w="120" w:type="dxa"/>
+              <w:bottom w:w="80" w:type="dxa"/>
+              <w:right w:w="120" w:type="dxa"/>
+            </w:tcMar>
+          </w:tcPr>
+          <w:p>
+            <w:r>
+              <w:rPr>
+                <w:b/>
+                <w:bCs/>
+                <w:color w:val="1F4E79"/>
+                <w:sz w:val="18"/>
+                <w:szCs w:val="18"/>
+              </w:rPr>
+              <w:t>[목표] colleges.txt 행 형식 오류 시 오류 출력 및 종료</w:t>
+            </w:r>
+          </w:p>
+          <w:p>
+            <w:r>
+              <w:rPr>
+                <w:sz w:val="18"/>
+                <w:szCs w:val="18"/>
+              </w:rPr>
+              <w:t>colleges.txt에 필드가 2개가 아닌 행 삽입 후 프로그램 실행</w:t>
+            </w:r>
+          </w:p>
+        </w:tc>
+        <w:tc>
+          <w:tcPr>
+            <w:tcW w:w="2800" w:type="dxa"/>
+            <w:tcBorders>
+              <w:top w:val="single" w:sz="1" w:space="0" w:color="AAAAAA"/>
+              <w:left w:val="single" w:sz="1" w:space="0" w:color="AAAAAA"/>
+              <w:bottom w:val="single" w:sz="1" w:space="0" w:color="AAAAAA"/>
+              <w:right w:val="single" w:sz="1" w:space="0" w:color="AAAAAA"/>
+            </w:tcBorders>
+            <w:tcMar>
+              <w:top w:w="80" w:type="dxa"/>
+              <w:left w:w="120" w:type="dxa"/>
+              <w:bottom w:w="80" w:type="dxa"/>
+              <w:right w:w="120" w:type="dxa"/>
+            </w:tcMar>
+          </w:tcPr>
+          <w:p>
+            <w:r>
+              <w:rPr>
+                <w:sz w:val="18"/>
+                <w:szCs w:val="18"/>
+              </w:rPr>
+              <w:t>!!! 오류: colleges.txt 1행 - 문법 형식이 올바르지 않습니다: '필드 수 오류'</w:t>
+            </w:r>
+          </w:p>
+          <w:p>
+            <w:r>
+              <w:rPr>
+                <w:sz w:val="18"/>
+                <w:szCs w:val="18"/>
+              </w:rPr>
+              <w:t>프로그램을 종료합니다.</w:t>
+            </w:r>
+          </w:p>
+        </w:tc>
+        <w:tc>
+          <w:tcPr>
+            <w:tcW w:w="1400" w:type="dxa"/>
+            <w:tcBorders>
+              <w:top w:val="single" w:sz="1" w:space="0" w:color="AAAAAA"/>
+              <w:left w:val="single" w:sz="1" w:space="0" w:color="AAAAAA"/>
+              <w:bottom w:val="single" w:sz="1" w:space="0" w:color="AAAAAA"/>
+              <w:right w:val="single" w:sz="1" w:space="0" w:color="AAAAAA"/>
+            </w:tcBorders>
+            <w:tcMar>
+              <w:top w:w="80" w:type="dxa"/>
+              <w:left w:w="120" w:type="dxa"/>
+              <w:bottom w:w="80" w:type="dxa"/>
+              <w:right w:w="120" w:type="dxa"/>
+            </w:tcMar>
+          </w:tcPr>
+          <w:p>
+            <w:r>
+              <w:rPr>
+                <w:sz w:val="18"/>
+                <w:szCs w:val="18"/>
+              </w:rPr>
+              <w:t>(좌동)</w:t>
             </w:r>
           </w:p>
         </w:tc>

</xml_diff>